<commit_message>
made my resume tailered to ai engineering
</commit_message>
<xml_diff>
--- a/Cover Letter General.docx
+++ b/Cover Letter General.docx
@@ -85,33 +85,43 @@
       <w:pPr>
         <w:pStyle w:val="Date"/>
         <w:rPr>
+          <w:b w:val="0"/>
+          <w:bCs/>
           <w:sz w:val="20"/>
           <w:szCs w:val="20"/>
         </w:rPr>
       </w:pPr>
       <w:r>
         <w:rPr>
-          <w:sz w:val="20"/>
-          <w:szCs w:val="20"/>
-        </w:rPr>
-        <w:t>Sep</w:t>
-      </w:r>
-      <w:r>
-        <w:rPr>
-          <w:sz w:val="20"/>
-          <w:szCs w:val="20"/>
-        </w:rPr>
-        <w:t xml:space="preserve"> 1</w:t>
-      </w:r>
-      <w:r>
-        <w:rPr>
-          <w:sz w:val="20"/>
-          <w:szCs w:val="20"/>
-        </w:rPr>
-        <w:t>9</w:t>
-      </w:r>
-      <w:r>
-        <w:rPr>
+          <w:b w:val="0"/>
+          <w:bCs/>
+          <w:sz w:val="20"/>
+          <w:szCs w:val="20"/>
+        </w:rPr>
+        <w:t>Nov</w:t>
+      </w:r>
+      <w:r>
+        <w:rPr>
+          <w:b w:val="0"/>
+          <w:bCs/>
+          <w:sz w:val="20"/>
+          <w:szCs w:val="20"/>
+        </w:rPr>
+        <w:t xml:space="preserve"> </w:t>
+      </w:r>
+      <w:r>
+        <w:rPr>
+          <w:b w:val="0"/>
+          <w:bCs/>
+          <w:sz w:val="20"/>
+          <w:szCs w:val="20"/>
+        </w:rPr>
+        <w:t>7</w:t>
+      </w:r>
+      <w:r>
+        <w:rPr>
+          <w:b w:val="0"/>
+          <w:bCs/>
           <w:sz w:val="20"/>
           <w:szCs w:val="20"/>
         </w:rPr>
@@ -190,25 +200,7 @@
           <w:sz w:val="20"/>
           <w:szCs w:val="20"/>
         </w:rPr>
-        <w:t xml:space="preserve">OpenAI </w:t>
-      </w:r>
-      <w:r>
-        <w:rPr>
-          <w:b/>
-          <w:bCs/>
-          <w:sz w:val="20"/>
-          <w:szCs w:val="20"/>
-        </w:rPr>
-        <w:t>I</w:t>
-      </w:r>
-      <w:r>
-        <w:rPr>
-          <w:b/>
-          <w:bCs/>
-          <w:sz w:val="20"/>
-          <w:szCs w:val="20"/>
-        </w:rPr>
-        <w:t>nc.</w:t>
+        <w:t>Oracle Inc.</w:t>
       </w:r>
     </w:p>
     <w:p>
@@ -305,7 +297,23 @@
           <w:sz w:val="20"/>
           <w:szCs w:val="20"/>
         </w:rPr>
-        <w:t>OpenAI, a company whose products I use daily and deeply value</w:t>
+        <w:t>Oracle</w:t>
+      </w:r>
+      <w:r>
+        <w:rPr>
+          <w:sz w:val="20"/>
+          <w:szCs w:val="20"/>
+        </w:rPr>
+        <w:t xml:space="preserve">, </w:t>
+      </w:r>
+      <w:r>
+        <w:rPr>
+          <w:b/>
+          <w:bCs/>
+          <w:sz w:val="20"/>
+          <w:szCs w:val="20"/>
+        </w:rPr>
+        <w:t>a company whose products I use daily and deeply value</w:t>
       </w:r>
       <w:r>
         <w:rPr>
@@ -361,6 +369,8 @@
     <w:p>
       <w:pPr>
         <w:rPr>
+          <w:b/>
+          <w:bCs/>
           <w:sz w:val="20"/>
           <w:szCs w:val="20"/>
         </w:rPr>
@@ -370,7 +380,23 @@
           <w:sz w:val="20"/>
           <w:szCs w:val="20"/>
         </w:rPr>
-        <w:t>One of my most impactful projects was an AI-powered application I developed for University of Washington professors to reduce repetitive email inquiries. By leveraging Gemini and integrating class resources such as syllabi, the application generated context-aware responses to student questions. As a result, professors saw a 40% reduction in email volume. I am</w:t>
+        <w:t xml:space="preserve">One of my most impactful projects was an AI-powered application I developed for University of Washington professors to reduce repetitive email inquiries. By leveraging Gemini and integrating class resources such as syllabi, the application generated context-aware responses to student questions. As a result, professors saw a </w:t>
+      </w:r>
+      <w:r>
+        <w:rPr>
+          <w:b/>
+          <w:bCs/>
+          <w:sz w:val="20"/>
+          <w:szCs w:val="20"/>
+        </w:rPr>
+        <w:t>40% reduction in email volume</w:t>
+      </w:r>
+      <w:r>
+        <w:rPr>
+          <w:sz w:val="20"/>
+          <w:szCs w:val="20"/>
+        </w:rPr>
+        <w:t>. I am</w:t>
       </w:r>
       <w:r>
         <w:rPr>
@@ -482,7 +508,16 @@
           <w:sz w:val="20"/>
           <w:szCs w:val="20"/>
         </w:rPr>
-        <w:t xml:space="preserve"> serve as a training tool for the team, ultimately improving guest safety and service efficiency.</w:t>
+        <w:t xml:space="preserve"> serve as a training tool for the team, </w:t>
+      </w:r>
+      <w:r>
+        <w:rPr>
+          <w:b/>
+          <w:bCs/>
+          <w:sz w:val="20"/>
+          <w:szCs w:val="20"/>
+        </w:rPr>
+        <w:t>ultimately improving guest safety and service efficiency.</w:t>
       </w:r>
     </w:p>
     <w:p>
@@ -531,7 +566,7 @@
           <w:sz w:val="20"/>
           <w:szCs w:val="20"/>
         </w:rPr>
-        <w:t xml:space="preserve">I strongly believe in OpenAI’s dedication to </w:t>
+        <w:t xml:space="preserve">I strongly believe in </w:t>
       </w:r>
       <w:r>
         <w:rPr>
@@ -540,7 +575,7 @@
           <w:sz w:val="20"/>
           <w:szCs w:val="20"/>
         </w:rPr>
-        <w:t>ensuring</w:t>
+        <w:t>Oracle’s dedication</w:t>
       </w:r>
       <w:r>
         <w:rPr>
@@ -549,7 +584,16 @@
           <w:sz w:val="20"/>
           <w:szCs w:val="20"/>
         </w:rPr>
-        <w:t xml:space="preserve"> that AI benefits all of humanity.</w:t>
+        <w:t xml:space="preserve"> to </w:t>
+      </w:r>
+      <w:r>
+        <w:rPr>
+          <w:b/>
+          <w:bCs/>
+          <w:sz w:val="20"/>
+          <w:szCs w:val="20"/>
+        </w:rPr>
+        <w:t>making the world a better place.</w:t>
       </w:r>
     </w:p>
     <w:p>
@@ -2678,12 +2722,17 @@
     <w:rsidRoot w:val="008F46B2"/>
     <w:rsid w:val="000334FC"/>
     <w:rsid w:val="00101E2C"/>
+    <w:rsid w:val="001140AB"/>
     <w:rsid w:val="0030752B"/>
+    <w:rsid w:val="0034767A"/>
     <w:rsid w:val="0068748D"/>
+    <w:rsid w:val="0070592F"/>
     <w:rsid w:val="008076A4"/>
     <w:rsid w:val="008C1E34"/>
     <w:rsid w:val="008F46B2"/>
+    <w:rsid w:val="0092130F"/>
     <w:rsid w:val="00A46B15"/>
+    <w:rsid w:val="00B07CC8"/>
     <w:rsid w:val="00E42BBF"/>
   </w:rsids>
   <m:mathPr>
@@ -3151,6 +3200,26 @@
     <w:name w:val="3CBDCBE27F5C85428B30E01649A6A7D6"/>
     <w:rsid w:val="008F46B2"/>
   </w:style>
+  <w:style w:type="paragraph" w:customStyle="1" w:styleId="7BF921D4E8CA314C9387D1BE8D28FF50">
+    <w:name w:val="7BF921D4E8CA314C9387D1BE8D28FF50"/>
+    <w:rsid w:val="001140AB"/>
+  </w:style>
+  <w:style w:type="paragraph" w:customStyle="1" w:styleId="3674F2F60175374FA44DAE33A53EF99D">
+    <w:name w:val="3674F2F60175374FA44DAE33A53EF99D"/>
+    <w:rsid w:val="001140AB"/>
+  </w:style>
+  <w:style w:type="paragraph" w:customStyle="1" w:styleId="286C4328BDE9064D82AED7244DD7C526">
+    <w:name w:val="286C4328BDE9064D82AED7244DD7C526"/>
+    <w:rsid w:val="001140AB"/>
+  </w:style>
+  <w:style w:type="paragraph" w:customStyle="1" w:styleId="77F2E7BD09E9A847B71418EFE68A418A">
+    <w:name w:val="77F2E7BD09E9A847B71418EFE68A418A"/>
+    <w:rsid w:val="001140AB"/>
+  </w:style>
+  <w:style w:type="paragraph" w:customStyle="1" w:styleId="660E931C1AA88947A192577714D68319">
+    <w:name w:val="660E931C1AA88947A192577714D68319"/>
+    <w:rsid w:val="001140AB"/>
+  </w:style>
 </w:styles>
 </file>
 

</xml_diff>